<commit_message>
error marcador no definido corregido
</commit_message>
<xml_diff>
--- a/Tema 1. Estadítica descriptiva.docx
+++ b/Tema 1. Estadítica descriptiva.docx
@@ -59,7 +59,7 @@
           <w:r>
             <w:fldChar w:fldCharType="separate"/>
           </w:r>
-          <w:hyperlink w:anchor="_Toc220665083" w:history="1">
+          <w:hyperlink w:anchor="_Toc223932522" w:history="1">
             <w:r>
               <w:rPr>
                 <w:rStyle w:val="Hipervnculo"/>
@@ -86,7 +86,7 @@
                 <w:noProof/>
                 <w:webHidden/>
               </w:rPr>
-              <w:instrText xml:space="preserve"> PAGEREF _Toc220665083 \h </w:instrText>
+              <w:instrText xml:space="preserve"> PAGEREF _Toc223932522 \h </w:instrText>
             </w:r>
             <w:r>
               <w:rPr>
@@ -131,7 +131,7 @@
               <w:lang w:eastAsia="es-ES"/>
             </w:rPr>
           </w:pPr>
-          <w:hyperlink w:anchor="_Toc220665084" w:history="1">
+          <w:hyperlink w:anchor="_Toc223932523" w:history="1">
             <w:r>
               <w:rPr>
                 <w:rStyle w:val="Hipervnculo"/>
@@ -158,7 +158,7 @@
                 <w:noProof/>
                 <w:webHidden/>
               </w:rPr>
-              <w:instrText xml:space="preserve"> PAGEREF _Toc220665084 \h </w:instrText>
+              <w:instrText xml:space="preserve"> PAGEREF _Toc223932523 \h </w:instrText>
             </w:r>
             <w:r>
               <w:rPr>
@@ -203,7 +203,7 @@
               <w:lang w:eastAsia="es-ES"/>
             </w:rPr>
           </w:pPr>
-          <w:hyperlink w:anchor="_Toc220665085" w:history="1">
+          <w:hyperlink w:anchor="_Toc223932524" w:history="1">
             <w:r>
               <w:rPr>
                 <w:rStyle w:val="Hipervnculo"/>
@@ -230,7 +230,7 @@
                 <w:noProof/>
                 <w:webHidden/>
               </w:rPr>
-              <w:instrText xml:space="preserve"> PAGEREF _Toc220665085 \h </w:instrText>
+              <w:instrText xml:space="preserve"> PAGEREF _Toc223932524 \h </w:instrText>
             </w:r>
             <w:r>
               <w:rPr>
@@ -275,7 +275,7 @@
               <w:lang w:eastAsia="es-ES"/>
             </w:rPr>
           </w:pPr>
-          <w:hyperlink w:anchor="_Toc220665086" w:history="1">
+          <w:hyperlink w:anchor="_Toc223932525" w:history="1">
             <w:r>
               <w:rPr>
                 <w:rStyle w:val="Hipervnculo"/>
@@ -302,7 +302,7 @@
                 <w:noProof/>
                 <w:webHidden/>
               </w:rPr>
-              <w:instrText xml:space="preserve"> PAGEREF _Toc220665086 \h </w:instrText>
+              <w:instrText xml:space="preserve"> PAGEREF _Toc223932525 \h </w:instrText>
             </w:r>
             <w:r>
               <w:rPr>
@@ -347,7 +347,7 @@
               <w:lang w:eastAsia="es-ES"/>
             </w:rPr>
           </w:pPr>
-          <w:hyperlink w:anchor="_Toc220665087" w:history="1">
+          <w:hyperlink w:anchor="_Toc223932526" w:history="1">
             <w:r>
               <w:rPr>
                 <w:rStyle w:val="Hipervnculo"/>
@@ -374,7 +374,7 @@
                 <w:noProof/>
                 <w:webHidden/>
               </w:rPr>
-              <w:instrText xml:space="preserve"> PAGEREF _Toc220665087 \h </w:instrText>
+              <w:instrText xml:space="preserve"> PAGEREF _Toc223932526 \h </w:instrText>
             </w:r>
             <w:r>
               <w:rPr>
@@ -419,7 +419,7 @@
               <w:lang w:eastAsia="es-ES"/>
             </w:rPr>
           </w:pPr>
-          <w:hyperlink w:anchor="_Toc220665088" w:history="1">
+          <w:hyperlink w:anchor="_Toc223932527" w:history="1">
             <w:r>
               <w:rPr>
                 <w:rStyle w:val="Hipervnculo"/>
@@ -446,7 +446,7 @@
                 <w:noProof/>
                 <w:webHidden/>
               </w:rPr>
-              <w:instrText xml:space="preserve"> PAGEREF _Toc220665088 \h </w:instrText>
+              <w:instrText xml:space="preserve"> PAGEREF _Toc223932527 \h </w:instrText>
             </w:r>
             <w:r>
               <w:rPr>
@@ -491,7 +491,7 @@
               <w:lang w:eastAsia="es-ES"/>
             </w:rPr>
           </w:pPr>
-          <w:hyperlink w:anchor="_Toc220665089" w:history="1">
+          <w:hyperlink w:anchor="_Toc223932528" w:history="1">
             <w:r>
               <w:rPr>
                 <w:rStyle w:val="Hipervnculo"/>
@@ -518,7 +518,7 @@
                 <w:noProof/>
                 <w:webHidden/>
               </w:rPr>
-              <w:instrText xml:space="preserve"> PAGEREF _Toc220665089 \h </w:instrText>
+              <w:instrText xml:space="preserve"> PAGEREF _Toc223932528 \h </w:instrText>
             </w:r>
             <w:r>
               <w:rPr>
@@ -563,7 +563,7 @@
               <w:lang w:eastAsia="es-ES"/>
             </w:rPr>
           </w:pPr>
-          <w:hyperlink w:anchor="_Toc220665090" w:history="1">
+          <w:hyperlink w:anchor="_Toc223932529" w:history="1">
             <w:r>
               <w:rPr>
                 <w:rStyle w:val="Hipervnculo"/>
@@ -590,7 +590,7 @@
                 <w:noProof/>
                 <w:webHidden/>
               </w:rPr>
-              <w:instrText xml:space="preserve"> PAGEREF _Toc220665090 \h </w:instrText>
+              <w:instrText xml:space="preserve"> PAGEREF _Toc223932529 \h </w:instrText>
             </w:r>
             <w:r>
               <w:rPr>
@@ -635,7 +635,7 @@
               <w:lang w:eastAsia="es-ES"/>
             </w:rPr>
           </w:pPr>
-          <w:hyperlink w:anchor="_Toc220665091" w:history="1">
+          <w:hyperlink w:anchor="_Toc223932530" w:history="1">
             <w:r>
               <w:rPr>
                 <w:rStyle w:val="Hipervnculo"/>
@@ -670,7 +670,7 @@
                 <w:noProof/>
                 <w:webHidden/>
               </w:rPr>
-              <w:instrText xml:space="preserve"> PAGEREF _Toc220665091 \h </w:instrText>
+              <w:instrText xml:space="preserve"> PAGEREF _Toc223932530 \h </w:instrText>
             </w:r>
             <w:r>
               <w:rPr>
@@ -715,7 +715,7 @@
               <w:lang w:eastAsia="es-ES"/>
             </w:rPr>
           </w:pPr>
-          <w:hyperlink w:anchor="_Toc220665092" w:history="1">
+          <w:hyperlink w:anchor="_Toc223932531" w:history="1">
             <w:r>
               <w:rPr>
                 <w:rStyle w:val="Hipervnculo"/>
@@ -750,7 +750,7 @@
                 <w:noProof/>
                 <w:webHidden/>
               </w:rPr>
-              <w:instrText xml:space="preserve"> PAGEREF _Toc220665092 \h </w:instrText>
+              <w:instrText xml:space="preserve"> PAGEREF _Toc223932531 \h </w:instrText>
             </w:r>
             <w:r>
               <w:rPr>
@@ -795,7 +795,7 @@
               <w:lang w:eastAsia="es-ES"/>
             </w:rPr>
           </w:pPr>
-          <w:hyperlink w:anchor="_Toc220665093" w:history="1">
+          <w:hyperlink w:anchor="_Toc223932532" w:history="1">
             <w:r>
               <w:rPr>
                 <w:rStyle w:val="Hipervnculo"/>
@@ -830,7 +830,7 @@
                 <w:noProof/>
                 <w:webHidden/>
               </w:rPr>
-              <w:instrText xml:space="preserve"> PAGEREF _Toc220665093 \h </w:instrText>
+              <w:instrText xml:space="preserve"> PAGEREF _Toc223932532 \h </w:instrText>
             </w:r>
             <w:r>
               <w:rPr>
@@ -875,7 +875,7 @@
               <w:lang w:eastAsia="es-ES"/>
             </w:rPr>
           </w:pPr>
-          <w:hyperlink w:anchor="_Toc220665094" w:history="1">
+          <w:hyperlink w:anchor="_Toc223932533" w:history="1">
             <w:r>
               <w:rPr>
                 <w:rStyle w:val="Hipervnculo"/>
@@ -910,7 +910,7 @@
                 <w:noProof/>
                 <w:webHidden/>
               </w:rPr>
-              <w:instrText xml:space="preserve"> PAGEREF _Toc220665094 \h </w:instrText>
+              <w:instrText xml:space="preserve"> PAGEREF _Toc223932533 \h </w:instrText>
             </w:r>
             <w:r>
               <w:rPr>
@@ -955,7 +955,7 @@
               <w:lang w:eastAsia="es-ES"/>
             </w:rPr>
           </w:pPr>
-          <w:hyperlink w:anchor="_Toc220665095" w:history="1">
+          <w:hyperlink w:anchor="_Toc223932534" w:history="1">
             <w:r>
               <w:rPr>
                 <w:rStyle w:val="Hipervnculo"/>
@@ -990,7 +990,7 @@
                 <w:noProof/>
                 <w:webHidden/>
               </w:rPr>
-              <w:instrText xml:space="preserve"> PAGEREF _Toc220665095 \h </w:instrText>
+              <w:instrText xml:space="preserve"> PAGEREF _Toc223932534 \h </w:instrText>
             </w:r>
             <w:r>
               <w:rPr>
@@ -1035,7 +1035,7 @@
               <w:lang w:eastAsia="es-ES"/>
             </w:rPr>
           </w:pPr>
-          <w:hyperlink w:anchor="_Toc220665096" w:history="1">
+          <w:hyperlink w:anchor="_Toc223932535" w:history="1">
             <w:r>
               <w:rPr>
                 <w:rStyle w:val="Hipervnculo"/>
@@ -1070,7 +1070,7 @@
                 <w:noProof/>
                 <w:webHidden/>
               </w:rPr>
-              <w:instrText xml:space="preserve"> PAGEREF _Toc220665096 \h </w:instrText>
+              <w:instrText xml:space="preserve"> PAGEREF _Toc223932535 \h </w:instrText>
             </w:r>
             <w:r>
               <w:rPr>
@@ -1115,7 +1115,7 @@
               <w:lang w:eastAsia="es-ES"/>
             </w:rPr>
           </w:pPr>
-          <w:hyperlink w:anchor="_Toc220665097" w:history="1">
+          <w:hyperlink w:anchor="_Toc223932536" w:history="1">
             <w:r>
               <w:rPr>
                 <w:rStyle w:val="Hipervnculo"/>
@@ -1142,7 +1142,7 @@
                 <w:noProof/>
                 <w:webHidden/>
               </w:rPr>
-              <w:instrText xml:space="preserve"> PAGEREF _Toc220665097 \h </w:instrText>
+              <w:instrText xml:space="preserve"> PAGEREF _Toc223932536 \h </w:instrText>
             </w:r>
             <w:r>
               <w:rPr>
@@ -1187,7 +1187,7 @@
               <w:lang w:eastAsia="es-ES"/>
             </w:rPr>
           </w:pPr>
-          <w:hyperlink w:anchor="_Toc220665098" w:history="1">
+          <w:hyperlink w:anchor="_Toc223932537" w:history="1">
             <w:r>
               <w:rPr>
                 <w:rStyle w:val="Hipervnculo"/>
@@ -1214,7 +1214,7 @@
                 <w:noProof/>
                 <w:webHidden/>
               </w:rPr>
-              <w:instrText xml:space="preserve"> PAGEREF _Toc220665098 \h </w:instrText>
+              <w:instrText xml:space="preserve"> PAGEREF _Toc223932537 \h </w:instrText>
             </w:r>
             <w:r>
               <w:rPr>
@@ -1259,7 +1259,7 @@
               <w:lang w:eastAsia="es-ES"/>
             </w:rPr>
           </w:pPr>
-          <w:hyperlink w:anchor="_Toc220665099" w:history="1">
+          <w:hyperlink w:anchor="_Toc223932538" w:history="1">
             <w:r>
               <w:rPr>
                 <w:rStyle w:val="Hipervnculo"/>
@@ -1286,7 +1286,7 @@
                 <w:noProof/>
                 <w:webHidden/>
               </w:rPr>
-              <w:instrText xml:space="preserve"> PAGEREF _Toc220665099 \h </w:instrText>
+              <w:instrText xml:space="preserve"> PAGEREF _Toc223932538 \h </w:instrText>
             </w:r>
             <w:r>
               <w:rPr>
@@ -1331,7 +1331,7 @@
               <w:lang w:eastAsia="es-ES"/>
             </w:rPr>
           </w:pPr>
-          <w:hyperlink w:anchor="_Toc220665100" w:history="1">
+          <w:hyperlink w:anchor="_Toc223932539" w:history="1">
             <w:r>
               <w:rPr>
                 <w:rStyle w:val="Hipervnculo"/>
@@ -1358,7 +1358,7 @@
                 <w:noProof/>
                 <w:webHidden/>
               </w:rPr>
-              <w:instrText xml:space="preserve"> PAGEREF _Toc220665100 \h </w:instrText>
+              <w:instrText xml:space="preserve"> PAGEREF _Toc223932539 \h </w:instrText>
             </w:r>
             <w:r>
               <w:rPr>
@@ -1403,7 +1403,7 @@
               <w:lang w:eastAsia="es-ES"/>
             </w:rPr>
           </w:pPr>
-          <w:hyperlink w:anchor="_Toc220665101" w:history="1">
+          <w:hyperlink w:anchor="_Toc223932540" w:history="1">
             <w:r>
               <w:rPr>
                 <w:rStyle w:val="Hipervnculo"/>
@@ -1430,7 +1430,7 @@
                 <w:noProof/>
                 <w:webHidden/>
               </w:rPr>
-              <w:instrText xml:space="preserve"> PAGEREF _Toc220665101 \h </w:instrText>
+              <w:instrText xml:space="preserve"> PAGEREF _Toc223932540 \h </w:instrText>
             </w:r>
             <w:r>
               <w:rPr>
@@ -1475,7 +1475,7 @@
               <w:lang w:eastAsia="es-ES"/>
             </w:rPr>
           </w:pPr>
-          <w:hyperlink w:anchor="_Toc220665102" w:history="1">
+          <w:hyperlink w:anchor="_Toc223932541" w:history="1">
             <w:r>
               <w:rPr>
                 <w:rStyle w:val="Hipervnculo"/>
@@ -1502,7 +1502,7 @@
                 <w:noProof/>
                 <w:webHidden/>
               </w:rPr>
-              <w:instrText xml:space="preserve"> PAGEREF _Toc220665102 \h </w:instrText>
+              <w:instrText xml:space="preserve"> PAGEREF _Toc223932541 \h </w:instrText>
             </w:r>
             <w:r>
               <w:rPr>
@@ -1547,7 +1547,7 @@
               <w:lang w:eastAsia="es-ES"/>
             </w:rPr>
           </w:pPr>
-          <w:hyperlink w:anchor="_Toc220665103" w:history="1">
+          <w:hyperlink w:anchor="_Toc223932542" w:history="1">
             <w:r>
               <w:rPr>
                 <w:rStyle w:val="Hipervnculo"/>
@@ -1574,7 +1574,7 @@
                 <w:noProof/>
                 <w:webHidden/>
               </w:rPr>
-              <w:instrText xml:space="preserve"> PAGEREF _Toc220665103 \h </w:instrText>
+              <w:instrText xml:space="preserve"> PAGEREF _Toc223932542 \h </w:instrText>
             </w:r>
             <w:r>
               <w:rPr>
@@ -1619,7 +1619,7 @@
               <w:lang w:eastAsia="es-ES"/>
             </w:rPr>
           </w:pPr>
-          <w:hyperlink w:anchor="_Toc220665104" w:history="1">
+          <w:hyperlink w:anchor="_Toc223932543" w:history="1">
             <w:r>
               <w:rPr>
                 <w:rStyle w:val="Hipervnculo"/>
@@ -1646,7 +1646,7 @@
                 <w:noProof/>
                 <w:webHidden/>
               </w:rPr>
-              <w:instrText xml:space="preserve"> PAGEREF _Toc220665104 \h </w:instrText>
+              <w:instrText xml:space="preserve"> PAGEREF _Toc223932543 \h </w:instrText>
             </w:r>
             <w:r>
               <w:rPr>
@@ -1691,7 +1691,7 @@
               <w:lang w:eastAsia="es-ES"/>
             </w:rPr>
           </w:pPr>
-          <w:hyperlink w:anchor="_Toc220665105" w:history="1">
+          <w:hyperlink w:anchor="_Toc223932544" w:history="1">
             <w:r>
               <w:rPr>
                 <w:rStyle w:val="Hipervnculo"/>
@@ -1718,7 +1718,7 @@
                 <w:noProof/>
                 <w:webHidden/>
               </w:rPr>
-              <w:instrText xml:space="preserve"> PAGEREF _Toc220665105 \h </w:instrText>
+              <w:instrText xml:space="preserve"> PAGEREF _Toc223932544 \h </w:instrText>
             </w:r>
             <w:r>
               <w:rPr>
@@ -1763,7 +1763,7 @@
               <w:lang w:eastAsia="es-ES"/>
             </w:rPr>
           </w:pPr>
-          <w:hyperlink w:anchor="_Toc220665106" w:history="1">
+          <w:hyperlink w:anchor="_Toc223932545" w:history="1">
             <w:r>
               <w:rPr>
                 <w:rStyle w:val="Hipervnculo"/>
@@ -1790,7 +1790,7 @@
                 <w:noProof/>
                 <w:webHidden/>
               </w:rPr>
-              <w:instrText xml:space="preserve"> PAGEREF _Toc220665106 \h </w:instrText>
+              <w:instrText xml:space="preserve"> PAGEREF _Toc223932545 \h </w:instrText>
             </w:r>
             <w:r>
               <w:rPr>
@@ -1835,7 +1835,7 @@
               <w:lang w:eastAsia="es-ES"/>
             </w:rPr>
           </w:pPr>
-          <w:hyperlink w:anchor="_Toc220665107" w:history="1">
+          <w:hyperlink w:anchor="_Toc223932546" w:history="1">
             <w:r>
               <w:rPr>
                 <w:rStyle w:val="Hipervnculo"/>
@@ -1862,7 +1862,7 @@
                 <w:noProof/>
                 <w:webHidden/>
               </w:rPr>
-              <w:instrText xml:space="preserve"> PAGEREF _Toc220665107 \h </w:instrText>
+              <w:instrText xml:space="preserve"> PAGEREF _Toc223932546 \h </w:instrText>
             </w:r>
             <w:r>
               <w:rPr>
@@ -1907,7 +1907,7 @@
               <w:lang w:eastAsia="es-ES"/>
             </w:rPr>
           </w:pPr>
-          <w:hyperlink w:anchor="_Toc220665108" w:history="1">
+          <w:hyperlink w:anchor="_Toc223932547" w:history="1">
             <w:r>
               <w:rPr>
                 <w:rStyle w:val="Hipervnculo"/>
@@ -1934,7 +1934,7 @@
                 <w:noProof/>
                 <w:webHidden/>
               </w:rPr>
-              <w:instrText xml:space="preserve"> PAGEREF _Toc220665108 \h </w:instrText>
+              <w:instrText xml:space="preserve"> PAGEREF _Toc223932547 \h </w:instrText>
             </w:r>
             <w:r>
               <w:rPr>
@@ -1979,7 +1979,7 @@
               <w:lang w:eastAsia="es-ES"/>
             </w:rPr>
           </w:pPr>
-          <w:hyperlink w:anchor="_Toc220665109" w:history="1">
+          <w:hyperlink w:anchor="_Toc223932548" w:history="1">
             <w:r>
               <w:rPr>
                 <w:rStyle w:val="Hipervnculo"/>
@@ -2006,7 +2006,7 @@
                 <w:noProof/>
                 <w:webHidden/>
               </w:rPr>
-              <w:instrText xml:space="preserve"> PAGEREF _Toc220665109 \h </w:instrText>
+              <w:instrText xml:space="preserve"> PAGEREF _Toc223932548 \h </w:instrText>
             </w:r>
             <w:r>
               <w:rPr>
@@ -2051,7 +2051,7 @@
               <w:lang w:eastAsia="es-ES"/>
             </w:rPr>
           </w:pPr>
-          <w:hyperlink w:anchor="_Toc220665110" w:history="1">
+          <w:hyperlink w:anchor="_Toc223932549" w:history="1">
             <w:r>
               <w:rPr>
                 <w:rStyle w:val="Hipervnculo"/>
@@ -2078,7 +2078,7 @@
                 <w:noProof/>
                 <w:webHidden/>
               </w:rPr>
-              <w:instrText xml:space="preserve"> PAGEREF _Toc220665110 \h </w:instrText>
+              <w:instrText xml:space="preserve"> PAGEREF _Toc223932549 \h </w:instrText>
             </w:r>
             <w:r>
               <w:rPr>
@@ -2123,7 +2123,7 @@
               <w:lang w:eastAsia="es-ES"/>
             </w:rPr>
           </w:pPr>
-          <w:hyperlink w:anchor="_Toc220665111" w:history="1">
+          <w:hyperlink w:anchor="_Toc223932550" w:history="1">
             <w:r>
               <w:rPr>
                 <w:rStyle w:val="Hipervnculo"/>
@@ -2150,7 +2150,7 @@
                 <w:noProof/>
                 <w:webHidden/>
               </w:rPr>
-              <w:instrText xml:space="preserve"> PAGEREF _Toc220665111 \h </w:instrText>
+              <w:instrText xml:space="preserve"> PAGEREF _Toc223932550 \h </w:instrText>
             </w:r>
             <w:r>
               <w:rPr>
@@ -2195,7 +2195,7 @@
               <w:lang w:eastAsia="es-ES"/>
             </w:rPr>
           </w:pPr>
-          <w:hyperlink w:anchor="_Toc220665112" w:history="1">
+          <w:hyperlink w:anchor="_Toc223932551" w:history="1">
             <w:r>
               <w:rPr>
                 <w:rStyle w:val="Hipervnculo"/>
@@ -2222,7 +2222,7 @@
                 <w:noProof/>
                 <w:webHidden/>
               </w:rPr>
-              <w:instrText xml:space="preserve"> PAGEREF _Toc220665112 \h </w:instrText>
+              <w:instrText xml:space="preserve"> PAGEREF _Toc223932551 \h </w:instrText>
             </w:r>
             <w:r>
               <w:rPr>
@@ -2267,7 +2267,7 @@
               <w:lang w:eastAsia="es-ES"/>
             </w:rPr>
           </w:pPr>
-          <w:hyperlink w:anchor="_Toc220665115" w:history="1">
+          <w:hyperlink w:anchor="_Toc223932554" w:history="1">
             <w:r>
               <w:rPr>
                 <w:rStyle w:val="Hipervnculo"/>
@@ -2294,7 +2294,7 @@
                 <w:noProof/>
                 <w:webHidden/>
               </w:rPr>
-              <w:instrText xml:space="preserve"> PAGEREF _Toc220665115 \h </w:instrText>
+              <w:instrText xml:space="preserve"> PAGEREF _Toc223932554 \h </w:instrText>
             </w:r>
             <w:r>
               <w:rPr>
@@ -2339,7 +2339,7 @@
               <w:lang w:eastAsia="es-ES"/>
             </w:rPr>
           </w:pPr>
-          <w:hyperlink w:anchor="_Toc220665116" w:history="1">
+          <w:hyperlink w:anchor="_Toc223932555" w:history="1">
             <w:r>
               <w:rPr>
                 <w:rStyle w:val="Hipervnculo"/>
@@ -2366,7 +2366,7 @@
                 <w:noProof/>
                 <w:webHidden/>
               </w:rPr>
-              <w:instrText xml:space="preserve"> PAGEREF _Toc220665116 \h </w:instrText>
+              <w:instrText xml:space="preserve"> PAGEREF _Toc223932555 \h </w:instrText>
             </w:r>
             <w:r>
               <w:rPr>
@@ -2411,7 +2411,7 @@
               <w:lang w:eastAsia="es-ES"/>
             </w:rPr>
           </w:pPr>
-          <w:hyperlink w:anchor="_Toc220665117" w:history="1">
+          <w:hyperlink w:anchor="_Toc223932556" w:history="1">
             <w:r>
               <w:rPr>
                 <w:rStyle w:val="Hipervnculo"/>
@@ -2438,7 +2438,7 @@
                 <w:noProof/>
                 <w:webHidden/>
               </w:rPr>
-              <w:instrText xml:space="preserve"> PAGEREF _Toc220665117 \h </w:instrText>
+              <w:instrText xml:space="preserve"> PAGEREF _Toc223932556 \h </w:instrText>
             </w:r>
             <w:r>
               <w:rPr>
@@ -2483,7 +2483,7 @@
               <w:lang w:eastAsia="es-ES"/>
             </w:rPr>
           </w:pPr>
-          <w:hyperlink w:anchor="_Toc220665118" w:history="1">
+          <w:hyperlink w:anchor="_Toc223932557" w:history="1">
             <w:r>
               <w:rPr>
                 <w:rStyle w:val="Hipervnculo"/>
@@ -2510,7 +2510,7 @@
                 <w:noProof/>
                 <w:webHidden/>
               </w:rPr>
-              <w:instrText xml:space="preserve"> PAGEREF _Toc220665118 \h </w:instrText>
+              <w:instrText xml:space="preserve"> PAGEREF _Toc223932557 \h </w:instrText>
             </w:r>
             <w:r>
               <w:rPr>
@@ -2555,7 +2555,7 @@
               <w:lang w:eastAsia="es-ES"/>
             </w:rPr>
           </w:pPr>
-          <w:hyperlink w:anchor="_Toc220665119" w:history="1">
+          <w:hyperlink w:anchor="_Toc223932558" w:history="1">
             <w:r>
               <w:rPr>
                 <w:rStyle w:val="Hipervnculo"/>
@@ -2590,7 +2590,7 @@
                 <w:noProof/>
                 <w:webHidden/>
               </w:rPr>
-              <w:instrText xml:space="preserve"> PAGEREF _Toc220665119 \h </w:instrText>
+              <w:instrText xml:space="preserve"> PAGEREF _Toc223932558 \h </w:instrText>
             </w:r>
             <w:r>
               <w:rPr>
@@ -2635,7 +2635,7 @@
               <w:lang w:eastAsia="es-ES"/>
             </w:rPr>
           </w:pPr>
-          <w:hyperlink w:anchor="_Toc220665120" w:history="1">
+          <w:hyperlink w:anchor="_Toc223932559" w:history="1">
             <w:r>
               <w:rPr>
                 <w:rStyle w:val="Hipervnculo"/>
@@ -2670,7 +2670,7 @@
                 <w:noProof/>
                 <w:webHidden/>
               </w:rPr>
-              <w:instrText xml:space="preserve"> PAGEREF _Toc220665120 \h </w:instrText>
+              <w:instrText xml:space="preserve"> PAGEREF _Toc223932559 \h </w:instrText>
             </w:r>
             <w:r>
               <w:rPr>
@@ -2715,7 +2715,7 @@
               <w:lang w:eastAsia="es-ES"/>
             </w:rPr>
           </w:pPr>
-          <w:hyperlink w:anchor="_Toc220665121" w:history="1">
+          <w:hyperlink w:anchor="_Toc223932560" w:history="1">
             <w:r>
               <w:rPr>
                 <w:rStyle w:val="Hipervnculo"/>
@@ -2742,7 +2742,7 @@
                 <w:noProof/>
                 <w:webHidden/>
               </w:rPr>
-              <w:instrText xml:space="preserve"> PAGEREF _Toc220665121 \h </w:instrText>
+              <w:instrText xml:space="preserve"> PAGEREF _Toc223932560 \h </w:instrText>
             </w:r>
             <w:r>
               <w:rPr>
@@ -2787,7 +2787,7 @@
               <w:lang w:eastAsia="es-ES"/>
             </w:rPr>
           </w:pPr>
-          <w:hyperlink w:anchor="_Toc220665122" w:history="1">
+          <w:hyperlink w:anchor="_Toc223932561" w:history="1">
             <w:r>
               <w:rPr>
                 <w:rStyle w:val="Hipervnculo"/>
@@ -2814,7 +2814,7 @@
                 <w:noProof/>
                 <w:webHidden/>
               </w:rPr>
-              <w:instrText xml:space="preserve"> PAGEREF _Toc220665122 \h </w:instrText>
+              <w:instrText xml:space="preserve"> PAGEREF _Toc223932561 \h </w:instrText>
             </w:r>
             <w:r>
               <w:rPr>
@@ -2859,7 +2859,7 @@
               <w:lang w:eastAsia="es-ES"/>
             </w:rPr>
           </w:pPr>
-          <w:hyperlink w:anchor="_Toc220665123" w:history="1">
+          <w:hyperlink w:anchor="_Toc223932562" w:history="1">
             <w:r>
               <w:rPr>
                 <w:rStyle w:val="Hipervnculo"/>
@@ -2886,7 +2886,7 @@
                 <w:noProof/>
                 <w:webHidden/>
               </w:rPr>
-              <w:instrText xml:space="preserve"> PAGEREF _Toc220665123 \h </w:instrText>
+              <w:instrText xml:space="preserve"> PAGEREF _Toc223932562 \h </w:instrText>
             </w:r>
             <w:r>
               <w:rPr>
@@ -2931,7 +2931,7 @@
               <w:lang w:eastAsia="es-ES"/>
             </w:rPr>
           </w:pPr>
-          <w:hyperlink w:anchor="_Toc220665124" w:history="1">
+          <w:hyperlink w:anchor="_Toc223932563" w:history="1">
             <w:r>
               <w:rPr>
                 <w:rStyle w:val="Hipervnculo"/>
@@ -2958,7 +2958,7 @@
                 <w:noProof/>
                 <w:webHidden/>
               </w:rPr>
-              <w:instrText xml:space="preserve"> PAGEREF _Toc220665124 \h </w:instrText>
+              <w:instrText xml:space="preserve"> PAGEREF _Toc223932563 \h </w:instrText>
             </w:r>
             <w:r>
               <w:rPr>
@@ -3003,7 +3003,7 @@
               <w:lang w:eastAsia="es-ES"/>
             </w:rPr>
           </w:pPr>
-          <w:hyperlink w:anchor="_Toc220665125" w:history="1">
+          <w:hyperlink w:anchor="_Toc223932564" w:history="1">
             <w:r>
               <w:rPr>
                 <w:rStyle w:val="Hipervnculo"/>
@@ -3030,7 +3030,7 @@
                 <w:noProof/>
                 <w:webHidden/>
               </w:rPr>
-              <w:instrText xml:space="preserve"> PAGEREF _Toc220665125 \h </w:instrText>
+              <w:instrText xml:space="preserve"> PAGEREF _Toc223932564 \h </w:instrText>
             </w:r>
             <w:r>
               <w:rPr>
@@ -3075,7 +3075,7 @@
               <w:lang w:eastAsia="es-ES"/>
             </w:rPr>
           </w:pPr>
-          <w:hyperlink w:anchor="_Toc220665126" w:history="1">
+          <w:hyperlink w:anchor="_Toc223932565" w:history="1">
             <w:r>
               <w:rPr>
                 <w:rStyle w:val="Hipervnculo"/>
@@ -3102,7 +3102,7 @@
                 <w:noProof/>
                 <w:webHidden/>
               </w:rPr>
-              <w:instrText xml:space="preserve"> PAGEREF _Toc220665126 \h </w:instrText>
+              <w:instrText xml:space="preserve"> PAGEREF _Toc223932565 \h </w:instrText>
             </w:r>
             <w:r>
               <w:rPr>
@@ -3123,142 +3123,6 @@
                 <w:webHidden/>
               </w:rPr>
               <w:t>13</w:t>
-            </w:r>
-            <w:r>
-              <w:rPr>
-                <w:noProof/>
-                <w:webHidden/>
-              </w:rPr>
-              <w:fldChar w:fldCharType="end"/>
-            </w:r>
-          </w:hyperlink>
-        </w:p>
-        <w:p>
-          <w:pPr>
-            <w:pStyle w:val="TDC2"/>
-            <w:tabs>
-              <w:tab w:val="right" w:leader="dot" w:pos="10456"/>
-            </w:tabs>
-            <w:rPr>
-              <w:rFonts w:asciiTheme="minorHAnsi" w:eastAsiaTheme="minorEastAsia" w:hAnsiTheme="minorHAnsi"/>
-              <w:noProof/>
-              <w:sz w:val="24"/>
-              <w:szCs w:val="24"/>
-              <w:lang w:eastAsia="es-ES"/>
-            </w:rPr>
-          </w:pPr>
-          <w:hyperlink w:anchor="_Toc220665127" w:history="1">
-            <w:r>
-              <w:rPr>
-                <w:rStyle w:val="Hipervnculo"/>
-                <w:noProof/>
-              </w:rPr>
-              <w:t>10.2. Aumento proporcional</w:t>
-            </w:r>
-            <w:r>
-              <w:rPr>
-                <w:noProof/>
-                <w:webHidden/>
-              </w:rPr>
-              <w:tab/>
-            </w:r>
-            <w:r>
-              <w:rPr>
-                <w:noProof/>
-                <w:webHidden/>
-              </w:rPr>
-              <w:fldChar w:fldCharType="begin"/>
-            </w:r>
-            <w:r>
-              <w:rPr>
-                <w:noProof/>
-                <w:webHidden/>
-              </w:rPr>
-              <w:instrText xml:space="preserve"> PAGEREF _Toc220665127 \h </w:instrText>
-            </w:r>
-            <w:r>
-              <w:rPr>
-                <w:noProof/>
-                <w:webHidden/>
-              </w:rPr>
-              <w:fldChar w:fldCharType="separate"/>
-            </w:r>
-            <w:r>
-              <w:rPr>
-                <w:b/>
-                <w:bCs/>
-                <w:noProof/>
-                <w:webHidden/>
-              </w:rPr>
-              <w:t>¡Error! Marcador no definido.</w:t>
-            </w:r>
-            <w:r>
-              <w:rPr>
-                <w:noProof/>
-                <w:webHidden/>
-              </w:rPr>
-              <w:fldChar w:fldCharType="end"/>
-            </w:r>
-          </w:hyperlink>
-        </w:p>
-        <w:p>
-          <w:pPr>
-            <w:pStyle w:val="TDC3"/>
-            <w:tabs>
-              <w:tab w:val="right" w:leader="dot" w:pos="10456"/>
-            </w:tabs>
-            <w:rPr>
-              <w:rFonts w:asciiTheme="minorHAnsi" w:eastAsiaTheme="minorEastAsia" w:hAnsiTheme="minorHAnsi"/>
-              <w:noProof/>
-              <w:sz w:val="24"/>
-              <w:szCs w:val="24"/>
-              <w:lang w:eastAsia="es-ES"/>
-            </w:rPr>
-          </w:pPr>
-          <w:hyperlink w:anchor="_Toc220665128" w:history="1">
-            <w:r>
-              <w:rPr>
-                <w:rStyle w:val="Hipervnculo"/>
-                <w:noProof/>
-              </w:rPr>
-              <w:t>10.2.1. Consecuencias de un aumento proporcional</w:t>
-            </w:r>
-            <w:r>
-              <w:rPr>
-                <w:noProof/>
-                <w:webHidden/>
-              </w:rPr>
-              <w:tab/>
-            </w:r>
-            <w:r>
-              <w:rPr>
-                <w:noProof/>
-                <w:webHidden/>
-              </w:rPr>
-              <w:fldChar w:fldCharType="begin"/>
-            </w:r>
-            <w:r>
-              <w:rPr>
-                <w:noProof/>
-                <w:webHidden/>
-              </w:rPr>
-              <w:instrText xml:space="preserve"> PAGEREF _Toc220665128 \h </w:instrText>
-            </w:r>
-            <w:r>
-              <w:rPr>
-                <w:noProof/>
-                <w:webHidden/>
-              </w:rPr>
-              <w:fldChar w:fldCharType="separate"/>
-            </w:r>
-            <w:r>
-              <w:rPr>
-                <w:b/>
-                <w:bCs/>
-                <w:noProof/>
-                <w:webHidden/>
-              </w:rPr>
-              <w:t>¡Error! Marcador no definido.</w:t>
             </w:r>
             <w:r>
               <w:rPr>
@@ -3298,7 +3162,7 @@
       <w:pPr>
         <w:pStyle w:val="Ttulo1"/>
       </w:pPr>
-      <w:bookmarkStart w:id="1" w:name="_Toc220665083"/>
+      <w:bookmarkStart w:id="1" w:name="_Toc223932522"/>
       <w:r>
         <w:lastRenderedPageBreak/>
         <w:t>Introducción</w:t>
@@ -3309,7 +3173,7 @@
       <w:pPr>
         <w:pStyle w:val="Ttulo2"/>
       </w:pPr>
-      <w:bookmarkStart w:id="2" w:name="_Toc220665084"/>
+      <w:bookmarkStart w:id="2" w:name="_Toc223932523"/>
       <w:r>
         <w:t>Definición de estadística</w:t>
       </w:r>
@@ -3355,7 +3219,7 @@
       <w:pPr>
         <w:pStyle w:val="Ttulo2"/>
       </w:pPr>
-      <w:bookmarkStart w:id="3" w:name="_Toc220665085"/>
+      <w:bookmarkStart w:id="3" w:name="_Toc223932524"/>
       <w:r>
         <w:t>Ramas de la estadística</w:t>
       </w:r>
@@ -3388,7 +3252,7 @@
       <w:pPr>
         <w:pStyle w:val="Ttulo1"/>
       </w:pPr>
-      <w:bookmarkStart w:id="4" w:name="_Toc220665086"/>
+      <w:bookmarkStart w:id="4" w:name="_Toc223932525"/>
       <w:r>
         <w:t>Población y muestra</w:t>
       </w:r>
@@ -3398,7 +3262,7 @@
       <w:pPr>
         <w:pStyle w:val="Ttulo2"/>
       </w:pPr>
-      <w:bookmarkStart w:id="5" w:name="_Toc220665087"/>
+      <w:bookmarkStart w:id="5" w:name="_Toc223932526"/>
       <w:r>
         <w:t>Población</w:t>
       </w:r>
@@ -3466,7 +3330,7 @@
       <w:pPr>
         <w:pStyle w:val="Ttulo2"/>
       </w:pPr>
-      <w:bookmarkStart w:id="6" w:name="_Toc220665088"/>
+      <w:bookmarkStart w:id="6" w:name="_Toc223932527"/>
       <w:r>
         <w:t>Muestra</w:t>
       </w:r>
@@ -3519,7 +3383,7 @@
       <w:pPr>
         <w:pStyle w:val="Ttulo1"/>
       </w:pPr>
-      <w:bookmarkStart w:id="7" w:name="_Toc220665089"/>
+      <w:bookmarkStart w:id="7" w:name="_Toc223932528"/>
       <w:r>
         <w:lastRenderedPageBreak/>
         <w:t>Clasificación de los parámetros o los estadísticos</w:t>
@@ -3710,7 +3574,7 @@
       <w:pPr>
         <w:pStyle w:val="Ttulo1"/>
       </w:pPr>
-      <w:bookmarkStart w:id="8" w:name="_Toc220665090"/>
+      <w:bookmarkStart w:id="8" w:name="_Toc223932529"/>
       <w:r>
         <w:t>Distribuciones de frecuencias</w:t>
       </w:r>
@@ -3734,7 +3598,7 @@
       <w:pPr>
         <w:pStyle w:val="Ttulo2"/>
       </w:pPr>
-      <w:bookmarkStart w:id="9" w:name="_Toc220665091"/>
+      <w:bookmarkStart w:id="9" w:name="_Toc223932530"/>
       <w:r>
         <w:t>Frecuencia absoluta, n</w:t>
       </w:r>
@@ -3758,7 +3622,7 @@
       <w:pPr>
         <w:pStyle w:val="Ttulo2"/>
       </w:pPr>
-      <w:bookmarkStart w:id="10" w:name="_Toc220665092"/>
+      <w:bookmarkStart w:id="10" w:name="_Toc223932531"/>
       <w:r>
         <w:t>Frecuencia absoluta acumulada, N</w:t>
       </w:r>
@@ -3895,7 +3759,7 @@
         <w:pStyle w:val="Ttulo2"/>
       </w:pPr>
       <w:bookmarkStart w:id="11" w:name="_Ref174449238"/>
-      <w:bookmarkStart w:id="12" w:name="_Toc220665093"/>
+      <w:bookmarkStart w:id="12" w:name="_Toc223932532"/>
       <w:r>
         <w:t>Frecuencia relativa, f</w:t>
       </w:r>
@@ -4015,7 +3879,7 @@
       <w:pPr>
         <w:pStyle w:val="Ttulo2"/>
       </w:pPr>
-      <w:bookmarkStart w:id="13" w:name="_Toc220665094"/>
+      <w:bookmarkStart w:id="13" w:name="_Toc223932533"/>
       <w:r>
         <w:t>Frecuencia relativa acumulada, F</w:t>
       </w:r>
@@ -4237,7 +4101,7 @@
       <w:pPr>
         <w:pStyle w:val="Ttulo2"/>
       </w:pPr>
-      <w:bookmarkStart w:id="14" w:name="_Toc220665095"/>
+      <w:bookmarkStart w:id="14" w:name="_Toc223932534"/>
       <w:r>
         <w:t>Porcentaje, p</w:t>
       </w:r>
@@ -4366,7 +4230,7 @@
       <w:pPr>
         <w:pStyle w:val="Ttulo2"/>
       </w:pPr>
-      <w:bookmarkStart w:id="15" w:name="_Toc220665096"/>
+      <w:bookmarkStart w:id="15" w:name="_Toc223932535"/>
       <w:r>
         <w:t>Porcentaje acumulado, P</w:t>
       </w:r>
@@ -4472,7 +4336,7 @@
         <w:pStyle w:val="Ttulo2"/>
       </w:pPr>
       <w:bookmarkStart w:id="16" w:name="_Ref174835865"/>
-      <w:bookmarkStart w:id="17" w:name="_Toc220665097"/>
+      <w:bookmarkStart w:id="17" w:name="_Toc223932536"/>
       <w:r>
         <w:t>Ejemplo de tabla con todas las frecuencias</w:t>
       </w:r>
@@ -5763,7 +5627,7 @@
       </w:pPr>
       <w:bookmarkStart w:id="19" w:name="_Ref174836612"/>
       <w:bookmarkStart w:id="20" w:name="_Ref174837861"/>
-      <w:bookmarkStart w:id="21" w:name="_Toc220665098"/>
+      <w:bookmarkStart w:id="21" w:name="_Toc223932537"/>
       <w:r>
         <w:t>Marca de clase</w:t>
       </w:r>
@@ -6798,7 +6662,7 @@
       <w:pPr>
         <w:pStyle w:val="Ttulo1"/>
       </w:pPr>
-      <w:bookmarkStart w:id="22" w:name="_Toc220665099"/>
+      <w:bookmarkStart w:id="22" w:name="_Toc223932538"/>
       <w:r>
         <w:t>Representaciones gráficas</w:t>
       </w:r>
@@ -6834,7 +6698,7 @@
       <w:pPr>
         <w:pStyle w:val="Ttulo2"/>
       </w:pPr>
-      <w:bookmarkStart w:id="23" w:name="_Toc220665100"/>
+      <w:bookmarkStart w:id="23" w:name="_Toc223932539"/>
       <w:r>
         <w:t>Diagrama de barras</w:t>
       </w:r>
@@ -6946,7 +6810,7 @@
         <w:pStyle w:val="Ttulo2"/>
       </w:pPr>
       <w:bookmarkStart w:id="24" w:name="_Ref174842706"/>
-      <w:bookmarkStart w:id="25" w:name="_Toc220665101"/>
+      <w:bookmarkStart w:id="25" w:name="_Toc223932540"/>
       <w:r>
         <w:t>Histograma</w:t>
       </w:r>
@@ -6986,7 +6850,7 @@
       <w:pPr>
         <w:pStyle w:val="Ttulo3"/>
       </w:pPr>
-      <w:bookmarkStart w:id="26" w:name="_Toc220665102"/>
+      <w:bookmarkStart w:id="26" w:name="_Toc223932541"/>
       <w:r>
         <w:lastRenderedPageBreak/>
         <w:t>Altura del intervalo = frecuencia</w:t>
@@ -7062,7 +6926,7 @@
       <w:pPr>
         <w:pStyle w:val="Ttulo3"/>
       </w:pPr>
-      <w:bookmarkStart w:id="27" w:name="_Toc220665103"/>
+      <w:bookmarkStart w:id="27" w:name="_Toc223932542"/>
       <w:r>
         <w:t>Altura del intervalo = densidad de frecuencia</w:t>
       </w:r>
@@ -8562,7 +8426,7 @@
         <w:pStyle w:val="Ttulo2"/>
       </w:pPr>
       <w:bookmarkStart w:id="28" w:name="_Ref174842770"/>
-      <w:bookmarkStart w:id="29" w:name="_Toc220665104"/>
+      <w:bookmarkStart w:id="29" w:name="_Toc223932543"/>
       <w:r>
         <w:t>Diagrama de cajas</w:t>
       </w:r>
@@ -8874,7 +8738,7 @@
         <w:pStyle w:val="Ttulo1"/>
       </w:pPr>
       <w:bookmarkStart w:id="30" w:name="_Toc211857299"/>
-      <w:bookmarkStart w:id="31" w:name="_Toc220665105"/>
+      <w:bookmarkStart w:id="31" w:name="_Toc223932544"/>
       <w:r>
         <w:t xml:space="preserve">Medidas </w:t>
       </w:r>
@@ -8892,7 +8756,7 @@
         <w:pStyle w:val="Ttulo2"/>
       </w:pPr>
       <w:bookmarkStart w:id="32" w:name="_Toc211857300"/>
-      <w:bookmarkStart w:id="33" w:name="_Toc220665106"/>
+      <w:bookmarkStart w:id="33" w:name="_Toc223932545"/>
       <w:r>
         <w:t>Media aritmética</w:t>
       </w:r>
@@ -8905,7 +8769,7 @@
       </w:pPr>
       <w:bookmarkStart w:id="34" w:name="_Ref175230743"/>
       <w:bookmarkStart w:id="35" w:name="_Toc211857301"/>
-      <w:bookmarkStart w:id="36" w:name="_Toc220665107"/>
+      <w:bookmarkStart w:id="36" w:name="_Toc223932546"/>
       <w:r>
         <w:t>Datos no agrupados</w:t>
       </w:r>
@@ -9034,7 +8898,7 @@
         </w:rPr>
       </w:pPr>
       <w:bookmarkStart w:id="37" w:name="_Toc211857302"/>
-      <w:bookmarkStart w:id="38" w:name="_Toc220665108"/>
+      <w:bookmarkStart w:id="38" w:name="_Toc223932547"/>
       <w:r>
         <w:rPr>
           <w:rFonts w:eastAsiaTheme="minorEastAsia"/>
@@ -10158,7 +10022,7 @@
         <w:pStyle w:val="Ttulo2"/>
       </w:pPr>
       <w:bookmarkStart w:id="39" w:name="_Toc211857312"/>
-      <w:bookmarkStart w:id="40" w:name="_Toc220665109"/>
+      <w:bookmarkStart w:id="40" w:name="_Toc223932548"/>
       <w:r>
         <w:t>Mediana</w:t>
       </w:r>
@@ -10207,7 +10071,7 @@
       <w:pPr>
         <w:pStyle w:val="Ttulo3"/>
       </w:pPr>
-      <w:bookmarkStart w:id="41" w:name="_Toc220665110"/>
+      <w:bookmarkStart w:id="41" w:name="_Toc223932549"/>
       <w:r>
         <w:t>Determinación del valor de la mediana</w:t>
       </w:r>
@@ -10720,7 +10584,7 @@
         <w:pStyle w:val="Ttulo2"/>
       </w:pPr>
       <w:bookmarkStart w:id="42" w:name="_Toc211857316"/>
-      <w:bookmarkStart w:id="43" w:name="_Toc220665111"/>
+      <w:bookmarkStart w:id="43" w:name="_Toc223932550"/>
       <w:r>
         <w:t>Moda, Mo</w:t>
       </w:r>
@@ -10740,7 +10604,7 @@
         <w:pStyle w:val="Ttulo1"/>
       </w:pPr>
       <w:bookmarkStart w:id="44" w:name="_Toc211857318"/>
-      <w:bookmarkStart w:id="45" w:name="_Toc220665112"/>
+      <w:bookmarkStart w:id="45" w:name="_Toc223932551"/>
       <w:r>
         <w:t>Medidas de dispersión</w:t>
       </w:r>
@@ -10945,6 +10809,7 @@
       <w:bookmarkStart w:id="51" w:name="_Toc219979029"/>
       <w:bookmarkStart w:id="52" w:name="_Toc219979075"/>
       <w:bookmarkStart w:id="53" w:name="_Toc220665113"/>
+      <w:bookmarkStart w:id="54" w:name="_Toc223932552"/>
       <w:bookmarkEnd w:id="46"/>
       <w:bookmarkEnd w:id="47"/>
       <w:bookmarkEnd w:id="48"/>
@@ -10953,6 +10818,7 @@
       <w:bookmarkEnd w:id="51"/>
       <w:bookmarkEnd w:id="52"/>
       <w:bookmarkEnd w:id="53"/>
+      <w:bookmarkEnd w:id="54"/>
     </w:p>
     <w:p>
       <w:pPr>
@@ -10974,15 +10840,15 @@
           <w:szCs w:val="24"/>
         </w:rPr>
       </w:pPr>
-      <w:bookmarkStart w:id="54" w:name="_Toc176225096"/>
-      <w:bookmarkStart w:id="55" w:name="_Toc177643031"/>
-      <w:bookmarkStart w:id="56" w:name="_Toc208921808"/>
-      <w:bookmarkStart w:id="57" w:name="_Toc208921851"/>
-      <w:bookmarkStart w:id="58" w:name="_Toc211857320"/>
-      <w:bookmarkStart w:id="59" w:name="_Toc219979030"/>
-      <w:bookmarkStart w:id="60" w:name="_Toc219979076"/>
-      <w:bookmarkStart w:id="61" w:name="_Toc220665114"/>
-      <w:bookmarkEnd w:id="54"/>
+      <w:bookmarkStart w:id="55" w:name="_Toc176225096"/>
+      <w:bookmarkStart w:id="56" w:name="_Toc177643031"/>
+      <w:bookmarkStart w:id="57" w:name="_Toc208921808"/>
+      <w:bookmarkStart w:id="58" w:name="_Toc208921851"/>
+      <w:bookmarkStart w:id="59" w:name="_Toc211857320"/>
+      <w:bookmarkStart w:id="60" w:name="_Toc219979030"/>
+      <w:bookmarkStart w:id="61" w:name="_Toc219979076"/>
+      <w:bookmarkStart w:id="62" w:name="_Toc220665114"/>
+      <w:bookmarkStart w:id="63" w:name="_Toc223932553"/>
       <w:bookmarkEnd w:id="55"/>
       <w:bookmarkEnd w:id="56"/>
       <w:bookmarkEnd w:id="57"/>
@@ -10990,35 +10856,17 @@
       <w:bookmarkEnd w:id="59"/>
       <w:bookmarkEnd w:id="60"/>
       <w:bookmarkEnd w:id="61"/>
-    </w:p>
-    <w:p>
-      <w:pPr>
-        <w:pStyle w:val="Ttulo2"/>
-      </w:pPr>
-      <w:bookmarkStart w:id="62" w:name="_Toc211857321"/>
-      <w:bookmarkStart w:id="63" w:name="_Toc220665115"/>
-      <w:r>
-        <w:t>Medidas de dispersión absoluta</w:t>
-      </w:r>
       <w:bookmarkEnd w:id="62"/>
       <w:bookmarkEnd w:id="63"/>
     </w:p>
     <w:p>
       <w:pPr>
-        <w:pStyle w:val="Textoindependiente"/>
-      </w:pPr>
-      <w:r>
-        <w:t>Cuantifican la dispersión que hay entre los valores y la tendencia central en las mismas unidades en las que está dada la tendencia central.</w:t>
-      </w:r>
-    </w:p>
-    <w:p>
-      <w:pPr>
-        <w:pStyle w:val="Ttulo3"/>
-      </w:pPr>
-      <w:bookmarkStart w:id="64" w:name="_Toc211857322"/>
-      <w:bookmarkStart w:id="65" w:name="_Toc220665116"/>
-      <w:r>
-        <w:t>Rango</w:t>
+        <w:pStyle w:val="Ttulo2"/>
+      </w:pPr>
+      <w:bookmarkStart w:id="64" w:name="_Toc211857321"/>
+      <w:bookmarkStart w:id="65" w:name="_Toc223932554"/>
+      <w:r>
+        <w:t>Medidas de dispersión absoluta</w:t>
       </w:r>
       <w:bookmarkEnd w:id="64"/>
       <w:bookmarkEnd w:id="65"/>
@@ -11028,20 +10876,40 @@
         <w:pStyle w:val="Textoindependiente"/>
       </w:pPr>
       <w:r>
-        <w:t>El rango es la distancia que hay entre el valor máximo y el valor mínimo.</w:t>
+        <w:t>Cuantifican la dispersión que hay entre los valores y la tendencia central en las mismas unidades en las que está dada la tendencia central.</w:t>
       </w:r>
     </w:p>
     <w:p>
       <w:pPr>
         <w:pStyle w:val="Ttulo3"/>
       </w:pPr>
-      <w:bookmarkStart w:id="66" w:name="_Toc211857323"/>
-      <w:bookmarkStart w:id="67" w:name="_Toc220665117"/>
-      <w:r>
-        <w:t>Percentiles y cuartiles</w:t>
+      <w:bookmarkStart w:id="66" w:name="_Toc211857322"/>
+      <w:bookmarkStart w:id="67" w:name="_Toc223932555"/>
+      <w:r>
+        <w:t>Rango</w:t>
       </w:r>
       <w:bookmarkEnd w:id="66"/>
       <w:bookmarkEnd w:id="67"/>
+    </w:p>
+    <w:p>
+      <w:pPr>
+        <w:pStyle w:val="Textoindependiente"/>
+      </w:pPr>
+      <w:r>
+        <w:t>El rango es la distancia que hay entre el valor máximo y el valor mínimo.</w:t>
+      </w:r>
+    </w:p>
+    <w:p>
+      <w:pPr>
+        <w:pStyle w:val="Ttulo3"/>
+      </w:pPr>
+      <w:bookmarkStart w:id="68" w:name="_Toc211857323"/>
+      <w:bookmarkStart w:id="69" w:name="_Toc223932556"/>
+      <w:r>
+        <w:t>Percentiles y cuartiles</w:t>
+      </w:r>
+      <w:bookmarkEnd w:id="68"/>
+      <w:bookmarkEnd w:id="69"/>
     </w:p>
     <w:p>
       <w:pPr>
@@ -11275,11 +11143,7 @@
         <w:pStyle w:val="Textoindependiente"/>
       </w:pPr>
       <w:r>
-        <w:t xml:space="preserve">Para buscar un percentil cualquier </w:t>
-      </w:r>
-      <w:proofErr w:type="spellStart"/>
-      <w:r>
-        <w:t>P</w:t>
+        <w:t>Para buscar un percentil cualquier P</w:t>
       </w:r>
       <w:r>
         <w:rPr>
@@ -11287,7 +11151,6 @@
         </w:rPr>
         <w:t>k</w:t>
       </w:r>
-      <w:proofErr w:type="spellEnd"/>
       <w:r>
         <w:t xml:space="preserve"> seguimos </w:t>
       </w:r>
@@ -11314,16 +11177,16 @@
           <w:rFonts w:eastAsiaTheme="minorEastAsia"/>
         </w:rPr>
       </w:pPr>
-      <w:bookmarkStart w:id="68" w:name="_Toc211857327"/>
-      <w:bookmarkStart w:id="69" w:name="_Toc220665118"/>
+      <w:bookmarkStart w:id="70" w:name="_Toc211857327"/>
+      <w:bookmarkStart w:id="71" w:name="_Toc223932557"/>
       <w:r>
         <w:rPr>
           <w:rFonts w:eastAsiaTheme="minorEastAsia"/>
         </w:rPr>
         <w:t>Rango intercuartílico</w:t>
       </w:r>
-      <w:bookmarkEnd w:id="68"/>
-      <w:bookmarkEnd w:id="69"/>
+      <w:bookmarkEnd w:id="70"/>
+      <w:bookmarkEnd w:id="71"/>
     </w:p>
     <w:p>
       <w:pPr>
@@ -11417,8 +11280,8 @@
           <w:rFonts w:eastAsiaTheme="minorEastAsia"/>
         </w:rPr>
       </w:pPr>
-      <w:bookmarkStart w:id="70" w:name="_Toc211857330"/>
-      <w:bookmarkStart w:id="71" w:name="_Toc220665119"/>
+      <w:bookmarkStart w:id="72" w:name="_Toc211857330"/>
+      <w:bookmarkStart w:id="73" w:name="_Toc223932558"/>
       <w:r>
         <w:rPr>
           <w:rFonts w:eastAsiaTheme="minorEastAsia"/>
@@ -11438,8 +11301,8 @@
         </w:rPr>
         <w:t>2</w:t>
       </w:r>
-      <w:bookmarkEnd w:id="70"/>
-      <w:bookmarkEnd w:id="71"/>
+      <w:bookmarkEnd w:id="72"/>
+      <w:bookmarkEnd w:id="73"/>
     </w:p>
     <w:p>
       <w:pPr>
@@ -12333,8 +12196,7 @@
           <w:rFonts w:eastAsiaTheme="minorEastAsia"/>
         </w:rPr>
       </w:pPr>
-      <w:bookmarkStart w:id="72" w:name="_Toc220665120"/>
-      <w:proofErr w:type="spellStart"/>
+      <w:bookmarkStart w:id="74" w:name="_Toc223932559"/>
       <w:r>
         <w:rPr>
           <w:rFonts w:eastAsiaTheme="minorEastAsia"/>
@@ -12357,14 +12219,7 @@
         <w:rPr>
           <w:rFonts w:eastAsiaTheme="minorEastAsia"/>
         </w:rPr>
-        <w:t>arianza</w:t>
-      </w:r>
-      <w:proofErr w:type="spellEnd"/>
-      <w:r>
-        <w:rPr>
-          <w:rFonts w:eastAsiaTheme="minorEastAsia"/>
-        </w:rPr>
-        <w:t xml:space="preserve">, </w:t>
+        <w:t xml:space="preserve">arianza, </w:t>
       </w:r>
       <w:r>
         <w:rPr>
@@ -12379,7 +12234,7 @@
         </w:rPr>
         <w:t>2</w:t>
       </w:r>
-      <w:bookmarkEnd w:id="72"/>
+      <w:bookmarkEnd w:id="74"/>
     </w:p>
     <w:tbl>
       <w:tblPr>
@@ -12826,7 +12681,6 @@
         </w:rPr>
         <w:t xml:space="preserve">Las unidades de la </w:t>
       </w:r>
-      <w:proofErr w:type="spellStart"/>
       <w:r>
         <w:rPr>
           <w:i w:val="0"/>
@@ -12845,20 +12699,8 @@
           <w:sz w:val="22"/>
           <w:szCs w:val="22"/>
         </w:rPr>
-        <w:t>varianza</w:t>
-      </w:r>
-      <w:proofErr w:type="spellEnd"/>
-      <w:r>
-        <w:rPr>
-          <w:i w:val="0"/>
-          <w:iCs w:val="0"/>
-          <w:color w:val="auto"/>
-          <w:sz w:val="22"/>
-          <w:szCs w:val="22"/>
-        </w:rPr>
-        <w:t xml:space="preserve"> </w:t>
-      </w:r>
-      <w:proofErr w:type="spellStart"/>
+        <w:t xml:space="preserve">varianza </w:t>
+      </w:r>
       <w:r>
         <w:rPr>
           <w:i w:val="0"/>
@@ -12877,18 +12719,7 @@
           <w:sz w:val="22"/>
           <w:szCs w:val="22"/>
         </w:rPr>
-        <w:t>son</w:t>
-      </w:r>
-      <w:proofErr w:type="spellEnd"/>
-      <w:r>
-        <w:rPr>
-          <w:i w:val="0"/>
-          <w:iCs w:val="0"/>
-          <w:color w:val="auto"/>
-          <w:sz w:val="22"/>
-          <w:szCs w:val="22"/>
-        </w:rPr>
-        <w:t xml:space="preserve"> las de los valores de la muestra elevados al cuadrado</w:t>
+        <w:t>son las de los valores de la muestra elevados al cuadrado</w:t>
       </w:r>
       <w:r>
         <w:t>.</w:t>
@@ -12898,19 +12729,19 @@
       <w:pPr>
         <w:pStyle w:val="Ttulo3"/>
       </w:pPr>
-      <w:bookmarkStart w:id="73" w:name="_Toc211857331"/>
-      <w:bookmarkStart w:id="74" w:name="_Toc220665121"/>
+      <w:bookmarkStart w:id="75" w:name="_Toc211857331"/>
+      <w:bookmarkStart w:id="76" w:name="_Toc223932560"/>
       <w:r>
         <w:t xml:space="preserve">Desviación típica, </w:t>
       </w:r>
-      <w:bookmarkEnd w:id="73"/>
+      <w:bookmarkEnd w:id="75"/>
       <w:r>
         <w:rPr>
           <w:rFonts w:eastAsiaTheme="minorEastAsia"/>
         </w:rPr>
         <w:t>S</w:t>
       </w:r>
-      <w:bookmarkEnd w:id="74"/>
+      <w:bookmarkEnd w:id="76"/>
     </w:p>
     <w:p>
       <w:pPr>
@@ -13418,13 +13249,8 @@
     </w:tbl>
     <w:p>
       <w:r>
-        <w:t xml:space="preserve">La desviación típica también se podría hacer con la </w:t>
-      </w:r>
-      <w:proofErr w:type="spellStart"/>
-      <w:r>
-        <w:t>cuasi-varianza</w:t>
-      </w:r>
-      <w:proofErr w:type="spellEnd"/>
+        <w:t>La desviación típica también se podría hacer con la cuasi-varianza</w:t>
+      </w:r>
       <w:r>
         <w:t>.</w:t>
       </w:r>
@@ -13433,25 +13259,25 @@
       <w:pPr>
         <w:pStyle w:val="Ttulo2"/>
       </w:pPr>
-      <w:bookmarkStart w:id="75" w:name="_Toc211857332"/>
-      <w:bookmarkStart w:id="76" w:name="_Toc220665122"/>
+      <w:bookmarkStart w:id="77" w:name="_Toc211857332"/>
+      <w:bookmarkStart w:id="78" w:name="_Toc223932561"/>
       <w:r>
         <w:t>Medidas de dispersión relativas</w:t>
       </w:r>
-      <w:bookmarkEnd w:id="75"/>
-      <w:bookmarkEnd w:id="76"/>
+      <w:bookmarkEnd w:id="77"/>
+      <w:bookmarkEnd w:id="78"/>
     </w:p>
     <w:p>
       <w:pPr>
         <w:pStyle w:val="Ttulo3"/>
       </w:pPr>
-      <w:bookmarkStart w:id="77" w:name="_Toc211857333"/>
-      <w:bookmarkStart w:id="78" w:name="_Toc220665123"/>
+      <w:bookmarkStart w:id="79" w:name="_Toc211857333"/>
+      <w:bookmarkStart w:id="80" w:name="_Toc223932562"/>
       <w:r>
         <w:t>Coeficiente de variación de Pearson, CV</w:t>
       </w:r>
-      <w:bookmarkEnd w:id="77"/>
-      <w:bookmarkEnd w:id="78"/>
+      <w:bookmarkEnd w:id="79"/>
+      <w:bookmarkEnd w:id="80"/>
     </w:p>
     <w:p>
       <w:pPr>
@@ -13706,26 +13532,26 @@
       <w:pPr>
         <w:pStyle w:val="Ttulo1"/>
       </w:pPr>
-      <w:bookmarkStart w:id="79" w:name="_Toc211857343"/>
-      <w:bookmarkStart w:id="80" w:name="_Toc220665124"/>
+      <w:bookmarkStart w:id="81" w:name="_Toc211857343"/>
+      <w:bookmarkStart w:id="82" w:name="_Toc223932563"/>
       <w:r>
         <w:lastRenderedPageBreak/>
         <w:t>Efectos de aumentos lineales y proporcionales</w:t>
       </w:r>
-      <w:bookmarkEnd w:id="79"/>
-      <w:bookmarkEnd w:id="80"/>
+      <w:bookmarkEnd w:id="81"/>
+      <w:bookmarkEnd w:id="82"/>
     </w:p>
     <w:p>
       <w:pPr>
         <w:pStyle w:val="Ttulo2"/>
       </w:pPr>
-      <w:bookmarkStart w:id="81" w:name="_Toc211857344"/>
-      <w:bookmarkStart w:id="82" w:name="_Toc220665125"/>
+      <w:bookmarkStart w:id="83" w:name="_Toc211857344"/>
+      <w:bookmarkStart w:id="84" w:name="_Toc223932564"/>
       <w:r>
         <w:t>Aumento lineal</w:t>
       </w:r>
-      <w:bookmarkEnd w:id="81"/>
-      <w:bookmarkEnd w:id="82"/>
+      <w:bookmarkEnd w:id="83"/>
+      <w:bookmarkEnd w:id="84"/>
     </w:p>
     <w:p>
       <w:pPr>
@@ -13788,19 +13614,7 @@
             <w:rPr>
               <w:rFonts w:ascii="Cambria Math" w:hAnsi="Cambria Math"/>
             </w:rPr>
-            <m:t>a</m:t>
-          </m:r>
-          <m:r>
-            <w:rPr>
-              <w:rFonts w:ascii="Cambria Math" w:hAnsi="Cambria Math"/>
-            </w:rPr>
-            <m:t>·</m:t>
-          </m:r>
-          <m:r>
-            <w:rPr>
-              <w:rFonts w:ascii="Cambria Math" w:hAnsi="Cambria Math"/>
-            </w:rPr>
-            <m:t>X</m:t>
+            <m:t>a·X</m:t>
           </m:r>
           <m:r>
             <m:rPr>
@@ -13836,16 +13650,16 @@
           <w:rFonts w:eastAsiaTheme="minorEastAsia"/>
         </w:rPr>
       </w:pPr>
-      <w:bookmarkStart w:id="83" w:name="_Toc211857345"/>
-      <w:bookmarkStart w:id="84" w:name="_Toc220665126"/>
+      <w:bookmarkStart w:id="85" w:name="_Toc211857345"/>
+      <w:bookmarkStart w:id="86" w:name="_Toc223932565"/>
       <w:r>
         <w:rPr>
           <w:rFonts w:eastAsiaTheme="minorEastAsia"/>
         </w:rPr>
         <w:t>Consecuencias de un aumento lineal</w:t>
       </w:r>
-      <w:bookmarkEnd w:id="83"/>
-      <w:bookmarkEnd w:id="84"/>
+      <w:bookmarkEnd w:id="85"/>
+      <w:bookmarkEnd w:id="86"/>
     </w:p>
     <w:tbl>
       <w:tblPr>
@@ -13914,16 +13728,7 @@
                   <w:rPr>
                     <w:rFonts w:ascii="Cambria Math" w:hAnsi="Cambria Math"/>
                   </w:rPr>
-                  <m:t>=</m:t>
-                </m:r>
-                <m:r>
-                  <m:rPr>
-                    <m:sty m:val="b"/>
-                  </m:rPr>
-                  <w:rPr>
-                    <w:rFonts w:ascii="Cambria Math" w:hAnsi="Cambria Math"/>
-                  </w:rPr>
-                  <m:t>a·</m:t>
+                  <m:t>=a·</m:t>
                 </m:r>
                 <m:r>
                   <m:rPr>
@@ -13941,16 +13746,7 @@
                   <w:rPr>
                     <w:rFonts w:ascii="Cambria Math" w:hAnsi="Cambria Math"/>
                   </w:rPr>
-                  <m:t>+</m:t>
-                </m:r>
-                <m:r>
-                  <m:rPr>
-                    <m:sty m:val="b"/>
-                  </m:rPr>
-                  <w:rPr>
-                    <w:rFonts w:ascii="Cambria Math" w:hAnsi="Cambria Math"/>
-                  </w:rPr>
-                  <m:t>b</m:t>
+                  <m:t>+b</m:t>
                 </m:r>
               </m:oMath>
             </m:oMathPara>
@@ -14043,13 +13839,7 @@
                   <w:rPr>
                     <w:rFonts w:ascii="Cambria Math" w:hAnsi="Cambria Math"/>
                   </w:rPr>
-                  <m:t>a</m:t>
-                </m:r>
-                <m:r>
-                  <w:rPr>
-                    <w:rFonts w:ascii="Cambria Math" w:hAnsi="Cambria Math"/>
-                  </w:rPr>
-                  <m:t>·</m:t>
+                  <m:t>a·</m:t>
                 </m:r>
                 <m:acc>
                   <m:accPr>
@@ -14164,19 +13954,7 @@
                   <w:rPr>
                     <w:rFonts w:ascii="Cambria Math" w:hAnsi="Cambria Math"/>
                   </w:rPr>
-                  <m:t>=a·</m:t>
-                </m:r>
-                <m:r>
-                  <w:rPr>
-                    <w:rFonts w:ascii="Cambria Math" w:hAnsi="Cambria Math"/>
-                  </w:rPr>
-                  <m:t>Me+</m:t>
-                </m:r>
-                <m:r>
-                  <w:rPr>
-                    <w:rFonts w:ascii="Cambria Math" w:hAnsi="Cambria Math"/>
-                  </w:rPr>
-                  <m:t>b</m:t>
+                  <m:t>=a·Me+b</m:t>
                 </m:r>
               </m:oMath>
             </m:oMathPara>
@@ -14255,19 +14033,7 @@
                   <w:rPr>
                     <w:rFonts w:ascii="Cambria Math" w:hAnsi="Cambria Math"/>
                   </w:rPr>
-                  <m:t>=a·</m:t>
-                </m:r>
-                <m:r>
-                  <w:rPr>
-                    <w:rFonts w:ascii="Cambria Math" w:hAnsi="Cambria Math"/>
-                  </w:rPr>
-                  <m:t>Mo+</m:t>
-                </m:r>
-                <m:r>
-                  <w:rPr>
-                    <w:rFonts w:ascii="Cambria Math" w:hAnsi="Cambria Math"/>
-                  </w:rPr>
-                  <m:t>b</m:t>
+                  <m:t>=a·Mo+b</m:t>
                 </m:r>
               </m:oMath>
             </m:oMathPara>
@@ -14347,13 +14113,7 @@
                   <w:rPr>
                     <w:rFonts w:ascii="Cambria Math" w:eastAsiaTheme="minorEastAsia" w:hAnsi="Cambria Math"/>
                   </w:rPr>
-                  <m:t>P+</m:t>
-                </m:r>
-                <m:r>
-                  <w:rPr>
-                    <w:rFonts w:ascii="Cambria Math" w:eastAsiaTheme="minorEastAsia" w:hAnsi="Cambria Math"/>
-                  </w:rPr>
-                  <m:t>b</m:t>
+                  <m:t>P+b</m:t>
                 </m:r>
               </m:oMath>
             </m:oMathPara>
@@ -14499,13 +14259,7 @@
                           <w:rPr>
                             <w:rFonts w:ascii="Cambria Math" w:hAnsi="Cambria Math"/>
                           </w:rPr>
-                          <m:t>·</m:t>
-                        </m:r>
-                        <m:r>
-                          <w:rPr>
-                            <w:rFonts w:ascii="Cambria Math" w:hAnsi="Cambria Math"/>
-                          </w:rPr>
-                          <m:t>S</m:t>
+                          <m:t>·S</m:t>
                         </m:r>
                       </m:e>
                       <m:sub>

</xml_diff>